<commit_message>
Docs: actualiza resumenes y manuales con las funciones nuevas
- Actualiza el contenido de los generadores (scripts/generar_manual.py y
  generar_resumen.py) y regenera Manual-Sistema/Abogados/Clientes y
  RESUMEN-PROYECTO en .md/.docx/.pdf (sincronizados).
- Documenta: Mis pendientes, Mi agenda, contadores en el menu, campanita de
  notificaciones, tamano de letra, pestana Sellos y logos, sello impreso en la
  credencial, estado de cuenta del cliente, recordatorios de tareas, exportar
  agenda del mes, buscador con actuaciones y reportes (cobranza, casos por mes).
- Actualiza a mano los resumenes no generados (Actualizaciones y Mejoras-y-Futuro)
  con la segunda etapa y la tabla de scripts (hasta db/24).
</commit_message>
<xml_diff>
--- a/Manual-Abogados-LexFive.docx
+++ b/Manual-Abogados-LexFive.docx
@@ -509,6 +509,75 @@
           <w:sz w:val="21"/>
           <w:szCs w:val="21"/>
         </w:rPr>
+        <w:t xml:space="preserve">«Mis pendientes»: sus tareas asignadas sin terminar (vencidas en rojo, las de hoy en ámbar); puede completarlas con un toque o abrirlas.</w:t>
+      </w:r>
+    </w:p>
+    <w:p>
+      <w:pPr>
+        <w:spacing w:before="0" w:after="40"/>
+        <w:ind w:left="360"/>
+      </w:pPr>
+      <w:r>
+        <w:rPr>
+          <w:b/>
+          <w:color w:val="A8853C"/>
+          <w:sz w:val="21"/>
+          <w:szCs w:val="21"/>
+        </w:rPr>
+        <w:t xml:space="preserve">•  </w:t>
+      </w:r>
+      <w:r>
+        <w:rPr>
+          <w:color w:val="1A2330"/>
+          <w:sz w:val="21"/>
+          <w:szCs w:val="21"/>
+        </w:rPr>
+        <w:t xml:space="preserve">«Mi agenda» (próximos 7 días): sus audiencias y plazos próximos, con acceso al proceso o al calendario.</w:t>
+      </w:r>
+    </w:p>
+    <w:p>
+      <w:pPr>
+        <w:spacing w:before="0" w:after="40"/>
+        <w:ind w:left="360"/>
+      </w:pPr>
+      <w:r>
+        <w:rPr>
+          <w:b/>
+          <w:color w:val="A8853C"/>
+          <w:sz w:val="21"/>
+          <w:szCs w:val="21"/>
+        </w:rPr>
+        <w:t xml:space="preserve">•  </w:t>
+      </w:r>
+      <w:r>
+        <w:rPr>
+          <w:color w:val="1A2330"/>
+          <w:sz w:val="21"/>
+          <w:szCs w:val="21"/>
+        </w:rPr>
+        <w:t xml:space="preserve">En el menú lateral aparecen contadores: tareas pendientes asignadas y consultas nuevas; y arriba, una campanita con las novedades.</w:t>
+      </w:r>
+    </w:p>
+    <w:p>
+      <w:pPr>
+        <w:spacing w:before="0" w:after="40"/>
+        <w:ind w:left="360"/>
+      </w:pPr>
+      <w:r>
+        <w:rPr>
+          <w:b/>
+          <w:color w:val="A8853C"/>
+          <w:sz w:val="21"/>
+          <w:szCs w:val="21"/>
+        </w:rPr>
+        <w:t xml:space="preserve">•  </w:t>
+      </w:r>
+      <w:r>
+        <w:rPr>
+          <w:color w:val="1A2330"/>
+          <w:sz w:val="21"/>
+          <w:szCs w:val="21"/>
+        </w:rPr>
         <w:t xml:space="preserve">Con «Recordar a los 5» envía por WhatsApp un recordatorio de la audiencia.</w:t>
       </w:r>
     </w:p>
@@ -532,30 +601,53 @@
           <w:sz w:val="21"/>
           <w:szCs w:val="21"/>
         </w:rPr>
-        <w:t xml:space="preserve">Puede buscar en todo el sistema (procesos, clientes y consultas) con el botón «Buscar» o el atajo Ctrl/Cmd + K.</w:t>
-      </w:r>
-    </w:p>
-    <w:p>
-      <w:pPr>
-        <w:spacing w:before="0" w:after="40"/>
-        <w:ind w:left="360"/>
-      </w:pPr>
-      <w:r>
-        <w:rPr>
-          <w:b/>
-          <w:color w:val="A8853C"/>
-          <w:sz w:val="21"/>
-          <w:szCs w:val="21"/>
-        </w:rPr>
-        <w:t xml:space="preserve">•  </w:t>
-      </w:r>
-      <w:r>
-        <w:rPr>
-          <w:color w:val="1A2330"/>
-          <w:sz w:val="21"/>
-          <w:szCs w:val="21"/>
-        </w:rPr>
-        <w:t xml:space="preserve">Puede cambiar entre modo claro y oscuro con el botón de la luna/sol.</w:t>
+        <w:t xml:space="preserve">Puede buscar en todo el sistema (procesos, clientes, consultas y actuaciones) con el botón «Buscar» o el atajo Ctrl/Cmd + K.</w:t>
+      </w:r>
+    </w:p>
+    <w:p>
+      <w:pPr>
+        <w:spacing w:before="0" w:after="40"/>
+        <w:ind w:left="360"/>
+      </w:pPr>
+      <w:r>
+        <w:rPr>
+          <w:b/>
+          <w:color w:val="A8853C"/>
+          <w:sz w:val="21"/>
+          <w:szCs w:val="21"/>
+        </w:rPr>
+        <w:t xml:space="preserve">•  </w:t>
+      </w:r>
+      <w:r>
+        <w:rPr>
+          <w:color w:val="1A2330"/>
+          <w:sz w:val="21"/>
+          <w:szCs w:val="21"/>
+        </w:rPr>
+        <w:t xml:space="preserve">Puede cambiar entre modo claro y oscuro, y ajustar el tamaño de letra (A− / A+).</w:t>
+      </w:r>
+    </w:p>
+    <w:p>
+      <w:pPr>
+        <w:spacing w:before="0" w:after="40"/>
+        <w:ind w:left="360"/>
+      </w:pPr>
+      <w:r>
+        <w:rPr>
+          <w:b/>
+          <w:color w:val="A8853C"/>
+          <w:sz w:val="21"/>
+          <w:szCs w:val="21"/>
+        </w:rPr>
+        <w:t xml:space="preserve">•  </w:t>
+      </w:r>
+      <w:r>
+        <w:rPr>
+          <w:color w:val="1A2330"/>
+          <w:sz w:val="21"/>
+          <w:szCs w:val="21"/>
+        </w:rPr>
+        <w:t xml:space="preserve">Cada mañana recibe por correo y notificación un recordatorio con sus audiencias, plazos y tareas del día siguiente.</w:t>
       </w:r>
     </w:p>
     <w:p>
@@ -848,7 +940,31 @@
           <w:sz w:val="21"/>
           <w:szCs w:val="21"/>
         </w:rPr>
-        <w:t xml:space="preserve">En «Agenda» ve el calendario con las audiencias y plazos del bufete. Puede exportar un evento a su calendario personal (celular o computadora) para que le avise.</w:t>
+        <w:t xml:space="preserve">En «Agenda» ve el calendario con las audiencias y plazos del bufete. Puede exportar un evento a su calendario personal (celular o computadora), o usar «Exportar mes (.ics)» para descargar todas las audiencias y plazos del mes en un solo archivo y abrirlo en Google Calendar, Outlook o el calendario del celular.</w:t>
+      </w:r>
+    </w:p>
+    <w:p>
+      <w:pPr>
+        <w:spacing w:before="60" w:after="120"/>
+        <w:ind w:left="120"/>
+        <w:shd w:val="clear" w:fill="F6F4ED"/>
+      </w:pPr>
+      <w:r>
+        <w:rPr>
+          <w:b/>
+          <w:color w:val="A8853C"/>
+          <w:sz w:val="20"/>
+          <w:szCs w:val="20"/>
+        </w:rPr>
+        <w:t xml:space="preserve">Aviso al cliente:  </w:t>
+      </w:r>
+      <w:r>
+        <w:rPr>
+          <w:color w:val="1A2330"/>
+          <w:sz w:val="20"/>
+          <w:szCs w:val="20"/>
+        </w:rPr>
+        <w:t xml:space="preserve">Cada vez que registra una nueva actuación en un proceso, su cliente recibe un aviso automático (campanita de su portal, notificación y correo) invitándolo a ver la novedad. El detalle no se envía por correo, por privacidad.</w:t>
       </w:r>
     </w:p>
     <w:p>
@@ -929,7 +1045,20 @@
           <w:sz w:val="21"/>
           <w:szCs w:val="21"/>
         </w:rPr>
-        <w:t xml:space="preserve">Los abogados y el administrador pueden generar carnets (credenciales) para sus procuradores desde la pestaña «Credenciales»: llenan los datos, eligen el logo, ajustan el fondo, usan «Vista previa» y luego «Imprimir / Guardar PDF». Las credenciales quedan guardadas en la nube para editarlas o reimprimirlas. (Vea el detalle en el Manual completo del Sistema.)</w:t>
+        <w:t xml:space="preserve">Los abogados y el administrador pueden generar carnets (credenciales) para sus procuradores desde la pestaña «Credenciales»: llenan los datos, eligen el logo, ajustan el fondo, usan «Vista previa» y luego «Imprimir / Guardar PDF». Las credenciales quedan guardadas en la nube para editarlas o reimprimirlas. El sello del bufete (el que elija en «Sellos y logos») se imprime ya en la credencial —en el frente y el reverso—, así solo agrega su firma o sello personal a mano. (Vea el detalle en el Manual completo del Sistema.)</w:t>
+      </w:r>
+    </w:p>
+    <w:p>
+      <w:pPr>
+        <w:spacing w:before="0" w:after="80"/>
+      </w:pPr>
+      <w:r>
+        <w:rPr>
+          <w:color w:val="1A2330"/>
+          <w:sz w:val="21"/>
+          <w:szCs w:val="21"/>
+        </w:rPr>
+        <w:t xml:space="preserve">En la pestaña «Sellos y logos» administra el logo y el sello del bufete: toque uno para verlo en grande y pulse «Usar este» para dejarlo como predeterminado, o suba el suyo (marque «Quitar fondo blanco» si es una foto, para que quede transparente). Lo elegido se aplica en la web, el panel, las credenciales y los memoriales.</w:t>
       </w:r>
     </w:p>
     <w:p>

</xml_diff>

<commit_message>
Docs: documenta el modulo de Certificados en manuales y resumenes
- Manual del Sistema y Manual de Abogados: nueva seccion de Certificados
  (formatos, hoja membretada, QR de verificacion contra BD, certificados
  emitidos: buscar/filtrar/reimprimir/eliminar). Renumeradas las secciones.
- RESUMEN-PROYECTO y resumenes a mano: agregado el modulo de certificados y los
  scripts db/25 y db/26 (total 26 scripts).
- Regenerados .md/.docx/.pdf desde los scripts.
</commit_message>
<xml_diff>
--- a/Manual-Abogados-LexFive.docx
+++ b/Manual-Abogados-LexFive.docx
@@ -195,7 +195,7 @@
           <w:sz w:val="21"/>
           <w:szCs w:val="21"/>
         </w:rPr>
-        <w:t xml:space="preserve">•  11. Consejos y seguridad</w:t>
+        <w:t xml:space="preserve">•  11. Certificados y constancias</w:t>
       </w:r>
     </w:p>
     <w:p>
@@ -209,7 +209,21 @@
           <w:sz w:val="21"/>
           <w:szCs w:val="21"/>
         </w:rPr>
-        <w:t xml:space="preserve">•  12. Soporte</w:t>
+        <w:t xml:space="preserve">•  12. Consejos y seguridad</w:t>
+      </w:r>
+    </w:p>
+    <w:p>
+      <w:pPr>
+        <w:spacing w:before="0" w:after="20"/>
+        <w:ind w:left="120"/>
+      </w:pPr>
+      <w:r>
+        <w:rPr>
+          <w:color w:val="1A2330"/>
+          <w:sz w:val="21"/>
+          <w:szCs w:val="21"/>
+        </w:rPr>
+        <w:t xml:space="preserve">•  13. Soporte</w:t>
       </w:r>
     </w:p>
     <w:p>
@@ -1072,99 +1086,89 @@
           <w:sz w:val="30"/>
           <w:szCs w:val="30"/>
         </w:rPr>
-        <w:t xml:space="preserve">11. Consejos y seguridad</w:t>
-      </w:r>
-    </w:p>
-    <w:p>
-      <w:pPr>
-        <w:spacing w:before="0" w:after="40"/>
-        <w:ind w:left="360"/>
-      </w:pPr>
-      <w:r>
-        <w:rPr>
-          <w:b/>
-          <w:color w:val="A8853C"/>
-          <w:sz w:val="21"/>
-          <w:szCs w:val="21"/>
-        </w:rPr>
-        <w:t xml:space="preserve">•  </w:t>
-      </w:r>
-      <w:r>
-        <w:rPr>
-          <w:color w:val="1A2330"/>
-          <w:sz w:val="21"/>
-          <w:szCs w:val="21"/>
-        </w:rPr>
-        <w:t xml:space="preserve">Cierre sesión al terminar, sobre todo en computadoras compartidas.</w:t>
-      </w:r>
-    </w:p>
-    <w:p>
-      <w:pPr>
-        <w:spacing w:before="0" w:after="40"/>
-        <w:ind w:left="360"/>
-      </w:pPr>
-      <w:r>
-        <w:rPr>
-          <w:b/>
-          <w:color w:val="A8853C"/>
-          <w:sz w:val="21"/>
-          <w:szCs w:val="21"/>
-        </w:rPr>
-        <w:t xml:space="preserve">•  </w:t>
-      </w:r>
-      <w:r>
-        <w:rPr>
-          <w:color w:val="1A2330"/>
-          <w:sz w:val="21"/>
-          <w:szCs w:val="21"/>
-        </w:rPr>
-        <w:t xml:space="preserve">Si pierde el internet, aparece un aviso de «sin conexión»: lo que guarde queda en el equipo y se sincroniza al volver la conexión.</w:t>
-      </w:r>
-    </w:p>
-    <w:p>
-      <w:pPr>
-        <w:spacing w:before="0" w:after="40"/>
-        <w:ind w:left="360"/>
-      </w:pPr>
-      <w:r>
-        <w:rPr>
-          <w:b/>
-          <w:color w:val="A8853C"/>
-          <w:sz w:val="21"/>
-          <w:szCs w:val="21"/>
-        </w:rPr>
-        <w:t xml:space="preserve">•  </w:t>
-      </w:r>
-      <w:r>
-        <w:rPr>
-          <w:color w:val="1A2330"/>
-          <w:sz w:val="21"/>
-          <w:szCs w:val="21"/>
-        </w:rPr>
-        <w:t xml:space="preserve">No comparta su contraseña. Si la olvida, pídale al administrador que la reinicie.</w:t>
-      </w:r>
-    </w:p>
-    <w:p>
-      <w:pPr>
-        <w:spacing w:before="0" w:after="40"/>
-        <w:ind w:left="360"/>
-      </w:pPr>
-      <w:r>
-        <w:rPr>
-          <w:b/>
-          <w:color w:val="A8853C"/>
-          <w:sz w:val="21"/>
-          <w:szCs w:val="21"/>
-        </w:rPr>
-        <w:t xml:space="preserve">•  </w:t>
-      </w:r>
-      <w:r>
-        <w:rPr>
-          <w:color w:val="1A2330"/>
-          <w:sz w:val="21"/>
-          <w:szCs w:val="21"/>
-        </w:rPr>
-        <w:t xml:space="preserve">Revise el panel general al iniciar el día para no perder audiencias ni plazos.</w:t>
+        <w:t xml:space="preserve">11. Certificados y constancias</w:t>
+      </w:r>
+    </w:p>
+    <w:p>
+      <w:pPr>
+        <w:spacing w:before="0" w:after="80"/>
+      </w:pPr>
+      <w:r>
+        <w:rPr>
+          <w:color w:val="1A2330"/>
+          <w:sz w:val="21"/>
+          <w:szCs w:val="21"/>
+        </w:rPr>
+        <w:t xml:space="preserve">En «Certificados» puede emitir, en hoja membretada del bufete (tamaño carta) y con QR de verificación, distintos documentos para procuradores y pasantes: certificado de trabajo, constancia de pasantía, horas de práctica, carta de recomendación, entre otros.</w:t>
+      </w:r>
+    </w:p>
+    <w:p>
+      <w:pPr>
+        <w:spacing w:before="0" w:after="40"/>
+        <w:ind w:left="360"/>
+      </w:pPr>
+      <w:r>
+        <w:rPr>
+          <w:b/>
+          <w:color w:val="A8853C"/>
+          <w:sz w:val="21"/>
+          <w:szCs w:val="21"/>
+        </w:rPr>
+        <w:t xml:space="preserve">•  </w:t>
+      </w:r>
+      <w:r>
+        <w:rPr>
+          <w:color w:val="1A2330"/>
+          <w:sz w:val="21"/>
+          <w:szCs w:val="21"/>
+        </w:rPr>
+        <w:t xml:space="preserve">Elija el tipo y complete los datos; el texto se redacta solo y puede editarlo.</w:t>
+      </w:r>
+    </w:p>
+    <w:p>
+      <w:pPr>
+        <w:spacing w:before="0" w:after="40"/>
+        <w:ind w:left="360"/>
+      </w:pPr>
+      <w:r>
+        <w:rPr>
+          <w:b/>
+          <w:color w:val="A8853C"/>
+          <w:sz w:val="21"/>
+          <w:szCs w:val="21"/>
+        </w:rPr>
+        <w:t xml:space="preserve">•  </w:t>
+      </w:r>
+      <w:r>
+        <w:rPr>
+          <w:color w:val="1A2330"/>
+          <w:sz w:val="21"/>
+          <w:szCs w:val="21"/>
+        </w:rPr>
+        <w:t xml:space="preserve">Imprima/guarde en PDF o descargue en Word. El sello del bufete va impreso.</w:t>
+      </w:r>
+    </w:p>
+    <w:p>
+      <w:pPr>
+        <w:spacing w:before="0" w:after="40"/>
+        <w:ind w:left="360"/>
+      </w:pPr>
+      <w:r>
+        <w:rPr>
+          <w:b/>
+          <w:color w:val="A8853C"/>
+          <w:sz w:val="21"/>
+          <w:szCs w:val="21"/>
+        </w:rPr>
+        <w:t xml:space="preserve">•  </w:t>
+      </w:r>
+      <w:r>
+        <w:rPr>
+          <w:color w:val="1A2330"/>
+          <w:sz w:val="21"/>
+          <w:szCs w:val="21"/>
+        </w:rPr>
+        <w:t xml:space="preserve">Cada certificado queda registrado y se verifica por su QR. En «Certificados emitidos» puede buscar, filtrar por fecha, ver quién lo emitió, reimprimir o eliminar.</w:t>
       </w:r>
     </w:p>
     <w:p>
@@ -1178,7 +1182,113 @@
           <w:sz w:val="30"/>
           <w:szCs w:val="30"/>
         </w:rPr>
-        <w:t xml:space="preserve">12. Soporte</w:t>
+        <w:t xml:space="preserve">12. Consejos y seguridad</w:t>
+      </w:r>
+    </w:p>
+    <w:p>
+      <w:pPr>
+        <w:spacing w:before="0" w:after="40"/>
+        <w:ind w:left="360"/>
+      </w:pPr>
+      <w:r>
+        <w:rPr>
+          <w:b/>
+          <w:color w:val="A8853C"/>
+          <w:sz w:val="21"/>
+          <w:szCs w:val="21"/>
+        </w:rPr>
+        <w:t xml:space="preserve">•  </w:t>
+      </w:r>
+      <w:r>
+        <w:rPr>
+          <w:color w:val="1A2330"/>
+          <w:sz w:val="21"/>
+          <w:szCs w:val="21"/>
+        </w:rPr>
+        <w:t xml:space="preserve">Cierre sesión al terminar, sobre todo en computadoras compartidas.</w:t>
+      </w:r>
+    </w:p>
+    <w:p>
+      <w:pPr>
+        <w:spacing w:before="0" w:after="40"/>
+        <w:ind w:left="360"/>
+      </w:pPr>
+      <w:r>
+        <w:rPr>
+          <w:b/>
+          <w:color w:val="A8853C"/>
+          <w:sz w:val="21"/>
+          <w:szCs w:val="21"/>
+        </w:rPr>
+        <w:t xml:space="preserve">•  </w:t>
+      </w:r>
+      <w:r>
+        <w:rPr>
+          <w:color w:val="1A2330"/>
+          <w:sz w:val="21"/>
+          <w:szCs w:val="21"/>
+        </w:rPr>
+        <w:t xml:space="preserve">Si pierde el internet, aparece un aviso de «sin conexión»: lo que guarde queda en el equipo y se sincroniza al volver la conexión.</w:t>
+      </w:r>
+    </w:p>
+    <w:p>
+      <w:pPr>
+        <w:spacing w:before="0" w:after="40"/>
+        <w:ind w:left="360"/>
+      </w:pPr>
+      <w:r>
+        <w:rPr>
+          <w:b/>
+          <w:color w:val="A8853C"/>
+          <w:sz w:val="21"/>
+          <w:szCs w:val="21"/>
+        </w:rPr>
+        <w:t xml:space="preserve">•  </w:t>
+      </w:r>
+      <w:r>
+        <w:rPr>
+          <w:color w:val="1A2330"/>
+          <w:sz w:val="21"/>
+          <w:szCs w:val="21"/>
+        </w:rPr>
+        <w:t xml:space="preserve">No comparta su contraseña. Si la olvida, pídale al administrador que la reinicie.</w:t>
+      </w:r>
+    </w:p>
+    <w:p>
+      <w:pPr>
+        <w:spacing w:before="0" w:after="40"/>
+        <w:ind w:left="360"/>
+      </w:pPr>
+      <w:r>
+        <w:rPr>
+          <w:b/>
+          <w:color w:val="A8853C"/>
+          <w:sz w:val="21"/>
+          <w:szCs w:val="21"/>
+        </w:rPr>
+        <w:t xml:space="preserve">•  </w:t>
+      </w:r>
+      <w:r>
+        <w:rPr>
+          <w:color w:val="1A2330"/>
+          <w:sz w:val="21"/>
+          <w:szCs w:val="21"/>
+        </w:rPr>
+        <w:t xml:space="preserve">Revise el panel general al iniciar el día para no perder audiencias ni plazos.</w:t>
+      </w:r>
+    </w:p>
+    <w:p>
+      <w:pPr>
+        <w:spacing w:before="200" w:after="80"/>
+      </w:pPr>
+      <w:r>
+        <w:rPr>
+          <w:b/>
+          <w:color w:val="0E1B2C"/>
+          <w:sz w:val="30"/>
+          <w:szCs w:val="30"/>
+        </w:rPr>
+        <w:t xml:space="preserve">13. Soporte</w:t>
       </w:r>
     </w:p>
     <w:p>

</xml_diff>

<commit_message>
Docs: documenta la pestana 'Sitio web' (imagenes y fondo) en manuales y resumen
- Manual del Sistema: nueva seccion 22 'Sitio web (imagenes y fondo de la pagina)' (hero, imagen de 'Sobre el bufete', patron de fondo e imagen de fondo del encabezado con capa oscura). Renumeradas 23 y 24.
- Manual para Abogados: nueva seccion 12 'Sitio web (imagenes y fondo)', breve. Renumeradas 13 y 14.
- RESUMEN-PROYECTO: agregada la pestana 'Sitio web' a las funciones del panel.
- Regenerados .md/.docx/.pdf desde los scripts.
</commit_message>
<xml_diff>
--- a/Manual-Abogados-LexFive.docx
+++ b/Manual-Abogados-LexFive.docx
@@ -209,7 +209,7 @@
           <w:sz w:val="21"/>
           <w:szCs w:val="21"/>
         </w:rPr>
-        <w:t xml:space="preserve">•  12. Consejos y seguridad</w:t>
+        <w:t xml:space="preserve">•  12. Sitio web (imágenes y fondo)</w:t>
       </w:r>
     </w:p>
     <w:p>
@@ -223,7 +223,21 @@
           <w:sz w:val="21"/>
           <w:szCs w:val="21"/>
         </w:rPr>
-        <w:t xml:space="preserve">•  13. Soporte</w:t>
+        <w:t xml:space="preserve">•  13. Consejos y seguridad</w:t>
+      </w:r>
+    </w:p>
+    <w:p>
+      <w:pPr>
+        <w:spacing w:before="0" w:after="20"/>
+        <w:ind w:left="120"/>
+      </w:pPr>
+      <w:r>
+        <w:rPr>
+          <w:color w:val="1A2330"/>
+          <w:sz w:val="21"/>
+          <w:szCs w:val="21"/>
+        </w:rPr>
+        <w:t xml:space="preserve">•  14. Soporte</w:t>
       </w:r>
     </w:p>
     <w:p>
@@ -1182,99 +1196,135 @@
           <w:sz w:val="30"/>
           <w:szCs w:val="30"/>
         </w:rPr>
-        <w:t xml:space="preserve">12. Consejos y seguridad</w:t>
-      </w:r>
-    </w:p>
-    <w:p>
-      <w:pPr>
-        <w:spacing w:before="0" w:after="40"/>
-        <w:ind w:left="360"/>
-      </w:pPr>
-      <w:r>
-        <w:rPr>
-          <w:b/>
-          <w:color w:val="A8853C"/>
-          <w:sz w:val="21"/>
-          <w:szCs w:val="21"/>
-        </w:rPr>
-        <w:t xml:space="preserve">•  </w:t>
-      </w:r>
-      <w:r>
-        <w:rPr>
-          <w:color w:val="1A2330"/>
-          <w:sz w:val="21"/>
-          <w:szCs w:val="21"/>
-        </w:rPr>
-        <w:t xml:space="preserve">Cierre sesión al terminar, sobre todo en computadoras compartidas.</w:t>
-      </w:r>
-    </w:p>
-    <w:p>
-      <w:pPr>
-        <w:spacing w:before="0" w:after="40"/>
-        <w:ind w:left="360"/>
-      </w:pPr>
-      <w:r>
-        <w:rPr>
-          <w:b/>
-          <w:color w:val="A8853C"/>
-          <w:sz w:val="21"/>
-          <w:szCs w:val="21"/>
-        </w:rPr>
-        <w:t xml:space="preserve">•  </w:t>
-      </w:r>
-      <w:r>
-        <w:rPr>
-          <w:color w:val="1A2330"/>
-          <w:sz w:val="21"/>
-          <w:szCs w:val="21"/>
-        </w:rPr>
-        <w:t xml:space="preserve">Si pierde el internet, aparece un aviso de «sin conexión»: lo que guarde queda en el equipo y se sincroniza al volver la conexión.</w:t>
-      </w:r>
-    </w:p>
-    <w:p>
-      <w:pPr>
-        <w:spacing w:before="0" w:after="40"/>
-        <w:ind w:left="360"/>
-      </w:pPr>
-      <w:r>
-        <w:rPr>
-          <w:b/>
-          <w:color w:val="A8853C"/>
-          <w:sz w:val="21"/>
-          <w:szCs w:val="21"/>
-        </w:rPr>
-        <w:t xml:space="preserve">•  </w:t>
-      </w:r>
-      <w:r>
-        <w:rPr>
-          <w:color w:val="1A2330"/>
-          <w:sz w:val="21"/>
-          <w:szCs w:val="21"/>
-        </w:rPr>
-        <w:t xml:space="preserve">No comparta su contraseña. Si la olvida, pídale al administrador que la reinicie.</w:t>
-      </w:r>
-    </w:p>
-    <w:p>
-      <w:pPr>
-        <w:spacing w:before="0" w:after="40"/>
-        <w:ind w:left="360"/>
-      </w:pPr>
-      <w:r>
-        <w:rPr>
-          <w:b/>
-          <w:color w:val="A8853C"/>
-          <w:sz w:val="21"/>
-          <w:szCs w:val="21"/>
-        </w:rPr>
-        <w:t xml:space="preserve">•  </w:t>
-      </w:r>
-      <w:r>
-        <w:rPr>
-          <w:color w:val="1A2330"/>
-          <w:sz w:val="21"/>
-          <w:szCs w:val="21"/>
-        </w:rPr>
-        <w:t xml:space="preserve">Revise el panel general al iniciar el día para no perder audiencias ni plazos.</w:t>
+        <w:t xml:space="preserve">12. Sitio web (imágenes y fondo)</w:t>
+      </w:r>
+    </w:p>
+    <w:p>
+      <w:pPr>
+        <w:spacing w:before="0" w:after="80"/>
+      </w:pPr>
+      <w:r>
+        <w:rPr>
+          <w:color w:val="1A2330"/>
+          <w:sz w:val="21"/>
+          <w:szCs w:val="21"/>
+        </w:rPr>
+        <w:t xml:space="preserve">En la pestaña «Sitio web» puede cambiar, sin ayuda técnica, las imágenes y el fondo de la página de inicio. Lo que cambie se ve en la web en unos segundos.</w:t>
+      </w:r>
+    </w:p>
+    <w:p>
+      <w:pPr>
+        <w:spacing w:before="0" w:after="40"/>
+        <w:ind w:left="360"/>
+      </w:pPr>
+      <w:r>
+        <w:rPr>
+          <w:b/>
+          <w:color w:val="A8853C"/>
+          <w:sz w:val="21"/>
+          <w:szCs w:val="21"/>
+        </w:rPr>
+        <w:t xml:space="preserve">•  </w:t>
+      </w:r>
+      <w:r>
+        <w:rPr>
+          <w:color w:val="1A2330"/>
+          <w:sz w:val="21"/>
+          <w:szCs w:val="21"/>
+        </w:rPr>
+        <w:t xml:space="preserve">Imagen principal (hero): la que va junto al título (horizontal o cuadrada, ~1200×900).</w:t>
+      </w:r>
+    </w:p>
+    <w:p>
+      <w:pPr>
+        <w:spacing w:before="0" w:after="40"/>
+        <w:ind w:left="360"/>
+      </w:pPr>
+      <w:r>
+        <w:rPr>
+          <w:b/>
+          <w:color w:val="A8853C"/>
+          <w:sz w:val="21"/>
+          <w:szCs w:val="21"/>
+        </w:rPr>
+        <w:t xml:space="preserve">•  </w:t>
+      </w:r>
+      <w:r>
+        <w:rPr>
+          <w:color w:val="1A2330"/>
+          <w:sz w:val="21"/>
+          <w:szCs w:val="21"/>
+        </w:rPr>
+        <w:t xml:space="preserve">Imagen de «Sobre el bufete»: la del recuadro de esa sección (vertical, ~800×950).</w:t>
+      </w:r>
+    </w:p>
+    <w:p>
+      <w:pPr>
+        <w:spacing w:before="0" w:after="40"/>
+        <w:ind w:left="360"/>
+      </w:pPr>
+      <w:r>
+        <w:rPr>
+          <w:b/>
+          <w:color w:val="A8853C"/>
+          <w:sz w:val="21"/>
+          <w:szCs w:val="21"/>
+        </w:rPr>
+        <w:t xml:space="preserve">•  </w:t>
+      </w:r>
+      <w:r>
+        <w:rPr>
+          <w:color w:val="1A2330"/>
+          <w:sz w:val="21"/>
+          <w:szCs w:val="21"/>
+        </w:rPr>
+        <w:t xml:space="preserve">Fondo del sitio: el patrón tenue (código binario, circuito, líneas o ninguno).</w:t>
+      </w:r>
+    </w:p>
+    <w:p>
+      <w:pPr>
+        <w:spacing w:before="0" w:after="40"/>
+        <w:ind w:left="360"/>
+      </w:pPr>
+      <w:r>
+        <w:rPr>
+          <w:b/>
+          <w:color w:val="A8853C"/>
+          <w:sz w:val="21"/>
+          <w:szCs w:val="21"/>
+        </w:rPr>
+        <w:t xml:space="preserve">•  </w:t>
+      </w:r>
+      <w:r>
+        <w:rPr>
+          <w:color w:val="1A2330"/>
+          <w:sz w:val="21"/>
+          <w:szCs w:val="21"/>
+        </w:rPr>
+        <w:t xml:space="preserve">Imagen de fondo del encabezado: opcional, una foto panorámica detrás del título; el sistema le pone una capa oscura para que el texto se lea.</w:t>
+      </w:r>
+    </w:p>
+    <w:p>
+      <w:pPr>
+        <w:spacing w:before="0" w:after="40"/>
+        <w:ind w:left="360"/>
+      </w:pPr>
+      <w:r>
+        <w:rPr>
+          <w:b/>
+          <w:color w:val="A8853C"/>
+          <w:sz w:val="21"/>
+          <w:szCs w:val="21"/>
+        </w:rPr>
+        <w:t xml:space="preserve">•  </w:t>
+      </w:r>
+      <w:r>
+        <w:rPr>
+          <w:color w:val="1A2330"/>
+          <w:sz w:val="21"/>
+          <w:szCs w:val="21"/>
+        </w:rPr>
+        <w:t xml:space="preserve">Cada una tiene botones «Subir» y «Quitar» (al quitar, vuelve la ilustración por defecto). Use JPG, PNG o WebP (máx. 6 MB).</w:t>
       </w:r>
     </w:p>
     <w:p>
@@ -1288,7 +1338,113 @@
           <w:sz w:val="30"/>
           <w:szCs w:val="30"/>
         </w:rPr>
-        <w:t xml:space="preserve">13. Soporte</w:t>
+        <w:t xml:space="preserve">13. Consejos y seguridad</w:t>
+      </w:r>
+    </w:p>
+    <w:p>
+      <w:pPr>
+        <w:spacing w:before="0" w:after="40"/>
+        <w:ind w:left="360"/>
+      </w:pPr>
+      <w:r>
+        <w:rPr>
+          <w:b/>
+          <w:color w:val="A8853C"/>
+          <w:sz w:val="21"/>
+          <w:szCs w:val="21"/>
+        </w:rPr>
+        <w:t xml:space="preserve">•  </w:t>
+      </w:r>
+      <w:r>
+        <w:rPr>
+          <w:color w:val="1A2330"/>
+          <w:sz w:val="21"/>
+          <w:szCs w:val="21"/>
+        </w:rPr>
+        <w:t xml:space="preserve">Cierre sesión al terminar, sobre todo en computadoras compartidas.</w:t>
+      </w:r>
+    </w:p>
+    <w:p>
+      <w:pPr>
+        <w:spacing w:before="0" w:after="40"/>
+        <w:ind w:left="360"/>
+      </w:pPr>
+      <w:r>
+        <w:rPr>
+          <w:b/>
+          <w:color w:val="A8853C"/>
+          <w:sz w:val="21"/>
+          <w:szCs w:val="21"/>
+        </w:rPr>
+        <w:t xml:space="preserve">•  </w:t>
+      </w:r>
+      <w:r>
+        <w:rPr>
+          <w:color w:val="1A2330"/>
+          <w:sz w:val="21"/>
+          <w:szCs w:val="21"/>
+        </w:rPr>
+        <w:t xml:space="preserve">Si pierde el internet, aparece un aviso de «sin conexión»: lo que guarde queda en el equipo y se sincroniza al volver la conexión.</w:t>
+      </w:r>
+    </w:p>
+    <w:p>
+      <w:pPr>
+        <w:spacing w:before="0" w:after="40"/>
+        <w:ind w:left="360"/>
+      </w:pPr>
+      <w:r>
+        <w:rPr>
+          <w:b/>
+          <w:color w:val="A8853C"/>
+          <w:sz w:val="21"/>
+          <w:szCs w:val="21"/>
+        </w:rPr>
+        <w:t xml:space="preserve">•  </w:t>
+      </w:r>
+      <w:r>
+        <w:rPr>
+          <w:color w:val="1A2330"/>
+          <w:sz w:val="21"/>
+          <w:szCs w:val="21"/>
+        </w:rPr>
+        <w:t xml:space="preserve">No comparta su contraseña. Si la olvida, pídale al administrador que la reinicie.</w:t>
+      </w:r>
+    </w:p>
+    <w:p>
+      <w:pPr>
+        <w:spacing w:before="0" w:after="40"/>
+        <w:ind w:left="360"/>
+      </w:pPr>
+      <w:r>
+        <w:rPr>
+          <w:b/>
+          <w:color w:val="A8853C"/>
+          <w:sz w:val="21"/>
+          <w:szCs w:val="21"/>
+        </w:rPr>
+        <w:t xml:space="preserve">•  </w:t>
+      </w:r>
+      <w:r>
+        <w:rPr>
+          <w:color w:val="1A2330"/>
+          <w:sz w:val="21"/>
+          <w:szCs w:val="21"/>
+        </w:rPr>
+        <w:t xml:space="preserve">Revise el panel general al iniciar el día para no perder audiencias ni plazos.</w:t>
+      </w:r>
+    </w:p>
+    <w:p>
+      <w:pPr>
+        <w:spacing w:before="200" w:after="80"/>
+      </w:pPr>
+      <w:r>
+        <w:rPr>
+          <w:b/>
+          <w:color w:val="0E1B2C"/>
+          <w:sz w:val="30"/>
+          <w:szCs w:val="30"/>
+        </w:rPr>
+        <w:t xml:space="preserve">14. Soporte</w:t>
       </w:r>
     </w:p>
     <w:p>

</xml_diff>